<commit_message>
Add XML sanitization and LibreOffice PDF conversion; implement auto-cleanup for old files
</commit_message>
<xml_diff>
--- a/template.docx
+++ b/template.docx
@@ -1058,357 +1058,304 @@
 </file>
 
 <file path=word/header1.xml><?xml version="1.0" encoding="utf-8"?>
-<w:hdr xmlns:wpc="http://schemas.microsoft.com/office/word/2010/wordprocessingCanvas" xmlns:cx="http://schemas.microsoft.com/office/drawing/2014/chartex" xmlns:cx1="http://schemas.microsoft.com/office/drawing/2015/9/8/chartex" xmlns:cx2="http://schemas.microsoft.com/office/drawing/2015/10/21/chartex" xmlns:cx3="http://schemas.microsoft.com/office/drawing/2016/5/9/chartex" xmlns:cx4="http://schemas.microsoft.com/office/drawing/2016/5/10/chartex" xmlns:cx5="http://schemas.microsoft.com/office/drawing/2016/5/11/chartex" xmlns:cx6="http://schemas.microsoft.com/office/drawing/2016/5/12/chartex" xmlns:cx7="http://schemas.microsoft.com/office/drawing/2016/5/13/chartex" xmlns:cx8="http://schemas.microsoft.com/office/drawing/2016/5/14/chartex" xmlns:mc="http://schemas.openxmlformats.org/markup-compatibility/2006" xmlns:aink="http://schemas.microsoft.com/office/drawing/2016/ink" xmlns:am3d="http://schemas.microsoft.com/office/drawing/2017/model3d" xmlns:o="urn:schemas-microsoft-com:office:office" xmlns:oel="http://schemas.microsoft.com/office/2019/extlst" xmlns:r="http://schemas.openxmlformats.org/officeDocument/2006/relationships" xmlns:m="http://schemas.openxmlformats.org/officeDocument/2006/math" xmlns:v="urn:schemas-microsoft-com:vml" xmlns:wp14="http://schemas.microsoft.com/office/word/2010/wordprocessingDrawing" xmlns:wp="http://schemas.openxmlformats.org/drawingml/2006/wordprocessingDrawing" xmlns:w10="urn:schemas-microsoft-com:office:word" xmlns:w="http://schemas.openxmlformats.org/wordprocessingml/2006/main" xmlns:w14="http://schemas.microsoft.com/office/word/2010/wordml" xmlns:w15="http://schemas.microsoft.com/office/word/2012/wordml" xmlns:w16cex="http://schemas.microsoft.com/office/word/2018/wordml/cex" xmlns:w16cid="http://schemas.microsoft.com/office/word/2016/wordml/cid" xmlns:w16="http://schemas.microsoft.com/office/word/2018/wordml" xmlns:w16du="http://schemas.microsoft.com/office/word/2023/wordml/word16du" xmlns:w16sdtdh="http://schemas.microsoft.com/office/word/2020/wordml/sdtdatahash" xmlns:w16sdtfl="http://schemas.microsoft.com/office/word/2024/wordml/sdtformatlock" xmlns:w16se="http://schemas.microsoft.com/office/word/2015/wordml/symex" xmlns:wpg="http://schemas.microsoft.com/office/word/2010/wordprocessingGroup" xmlns:wpi="http://schemas.microsoft.com/office/word/2010/wordprocessingInk" xmlns:wne="http://schemas.microsoft.com/office/word/2006/wordml" xmlns:wps="http://schemas.microsoft.com/office/word/2010/wordprocessingShape" mc:Ignorable="w14 w15 w16se w16cid w16 w16cex w16sdtdh w16sdtfl w16du wp14">
+<w:hdr xmlns:wpc="http://schemas.microsoft.com/office/word/2010/wordprocessingCanvas" xmlns:mc="http://schemas.openxmlformats.org/markup-compatibility/2006" xmlns:r="http://schemas.openxmlformats.org/officeDocument/2006/relationships" xmlns:m="http://schemas.openxmlformats.org/officeDocument/2006/math" xmlns:v="urn:schemas-microsoft-com:vml" xmlns:wp14="http://schemas.microsoft.com/office/word/2010/wordprocessingDrawing" xmlns:wp="http://schemas.openxmlformats.org/drawingml/2006/wordprocessingDrawing" xmlns:w10="urn:schemas-microsoft-com:office:word" xmlns:w="http://schemas.openxmlformats.org/wordprocessingml/2006/main" xmlns:w14="http://schemas.microsoft.com/office/word/2010/wordml" xmlns:w15="http://schemas.microsoft.com/office/word/2012/wordml" xmlns:wne="http://schemas.microsoft.com/office/word/2006/wordml" xmlns:wps="http://schemas.microsoft.com/office/word/2010/wordprocessingShape" xmlns:wpg="http://schemas.microsoft.com/office/word/2010/wordprocessingGroup" xmlns:a="http://schemas.openxmlformats.org/drawingml/2006/main" mc:Ignorable="w14 w15 wp14">
+  <!-- Blue background rectangle -->
   <w:p>
     <w:pPr>
       <w:pStyle w:val="BodyText"/>
-      <w:spacing w:before="0" w:line="14" w:lineRule="auto"/>
-      <w:rPr>
-        <w:sz w:val="20"/>
-      </w:rPr>
+      <w:spacing w:before="0" w:after="0" w:line="14" w:lineRule="auto"/>
     </w:pPr>
     <w:r>
-      <w:pict w14:anchorId="3C5389CE">
-        <v:shapetype id="_x0000_t202" coordsize="21600,21600" o:spt="202" path="m,l,21600r21600,l21600,xe">
-          <v:stroke joinstyle="miter"/>
-          <v:path gradientshapeok="t" o:connecttype="rect"/>
-        </v:shapetype>
-        <v:shape id="docshape4" o:spid="_x0000_s1027" type="#_x0000_t202" style="position:absolute;margin-left:12.2pt;margin-top:12.6pt;width:259.2pt;height:26.7pt;z-index:-15778304;mso-position-horizontal-relative:page;mso-position-vertical-relative:page" filled="f" stroked="f">
-          <v:textbox style="mso-next-textbox:#docshape4" inset="0,0,0,0">
-            <w:txbxContent>
-              <w:p>
-                <w:pPr>
-                  <w:spacing w:before="28" w:line="242" w:lineRule="exact"/>
-                  <w:ind w:left="20"/>
-                  <w:rPr>
-                    <w:rFonts w:ascii="Poppins" w:hAnsi="Poppins" w:cs="Poppins"/>
-                    <w:sz w:val="20"/>
-                  </w:rPr>
-                </w:pPr>
-                <w:r>
-                  <w:rPr>
-                    <w:rFonts w:ascii="Poppins" w:hAnsi="Poppins" w:cs="Poppins"/>
-                    <w:color w:val="FFFFFF"/>
-                    <w:spacing w:val="-2"/>
-                    <w:sz w:val="20"/>
-                  </w:rPr>
-                  <w:t>Equity</w:t>
-                </w:r>
-                <w:r>
-                  <w:rPr>
-                    <w:rFonts w:ascii="Poppins" w:hAnsi="Poppins" w:cs="Poppins"/>
-                    <w:color w:val="FFFFFF"/>
-                    <w:spacing w:val="-10"/>
-                    <w:sz w:val="20"/>
-                  </w:rPr>
-                  <w:t xml:space="preserve"> </w:t>
-                </w:r>
-                <w:r>
-                  <w:rPr>
-                    <w:rFonts w:ascii="Poppins" w:hAnsi="Poppins" w:cs="Poppins"/>
-                    <w:color w:val="FFFFFF"/>
-                    <w:spacing w:val="-2"/>
-                    <w:sz w:val="20"/>
-                  </w:rPr>
-                  <w:t>Capital</w:t>
-                </w:r>
-                <w:r>
-                  <w:rPr>
-                    <w:rFonts w:ascii="Poppins" w:hAnsi="Poppins" w:cs="Poppins"/>
-                    <w:color w:val="FFFFFF"/>
-                    <w:spacing w:val="-5"/>
-                    <w:sz w:val="20"/>
-                  </w:rPr>
-                  <w:t xml:space="preserve"> </w:t>
-                </w:r>
-                <w:r>
-                  <w:rPr>
-                    <w:rFonts w:ascii="Poppins" w:hAnsi="Poppins" w:cs="Poppins"/>
-                    <w:color w:val="FFFFFF"/>
-                    <w:spacing w:val="-2"/>
-                    <w:sz w:val="20"/>
-                  </w:rPr>
-                  <w:t>Market</w:t>
-                </w:r>
-                <w:r>
-                  <w:rPr>
-                    <w:rFonts w:ascii="Poppins" w:hAnsi="Poppins" w:cs="Poppins"/>
-                    <w:color w:val="FFFFFF"/>
-                    <w:spacing w:val="-7"/>
-                    <w:sz w:val="20"/>
-                  </w:rPr>
-                  <w:t xml:space="preserve"> </w:t>
-                </w:r>
-                <w:r>
-                  <w:rPr>
-                    <w:rFonts w:ascii="Poppins" w:hAnsi="Poppins" w:cs="Poppins"/>
-                    <w:color w:val="FFFFFF"/>
-                    <w:spacing w:val="-2"/>
-                    <w:sz w:val="20"/>
-                  </w:rPr>
-                  <w:t>Updates</w:t>
-                </w:r>
-                <w:r>
-                  <w:rPr>
-                    <w:rFonts w:ascii="Poppins" w:hAnsi="Poppins" w:cs="Poppins"/>
-                    <w:color w:val="FFFFFF"/>
-                    <w:spacing w:val="-5"/>
-                    <w:sz w:val="20"/>
-                  </w:rPr>
-                  <w:t xml:space="preserve"> </w:t>
-                </w:r>
-                <w:r>
-                  <w:rPr>
-                    <w:rFonts w:ascii="Poppins" w:hAnsi="Poppins" w:cs="Poppins"/>
-                    <w:color w:val="FFFFFF"/>
-                    <w:spacing w:val="-2"/>
-                    <w:sz w:val="20"/>
-                  </w:rPr>
-                  <w:t>(</w:t>
-                </w:r>
-                <w:r>
-                  <w:rPr>
-                    <w:rFonts w:ascii="Poppins" w:hAnsi="Poppins" w:cs="Poppins"/>
-                    <w:color w:val="FFFFFF"/>
-                    <w:spacing w:val="-2"/>
-                    <w:sz w:val="20"/>
-                  </w:rPr>
-                  <w:fldChar w:fldCharType="begin"/>
-                </w:r>
-                <w:r>
-                  <w:rPr>
-                    <w:rFonts w:ascii="Poppins" w:hAnsi="Poppins" w:cs="Poppins"/>
-                    <w:color w:val="FFFFFF"/>
-                    <w:spacing w:val="-2"/>
-                    <w:sz w:val="20"/>
-                  </w:rPr>
-                  <w:instrText xml:space="preserve"> PAGE </w:instrText>
-                </w:r>
-                <w:r>
-                  <w:rPr>
-                    <w:rFonts w:ascii="Poppins" w:hAnsi="Poppins" w:cs="Poppins"/>
-                    <w:color w:val="FFFFFF"/>
-                    <w:spacing w:val="-2"/>
-                    <w:sz w:val="20"/>
-                  </w:rPr>
-                  <w:fldChar w:fldCharType="separate"/>
-                </w:r>
-                <w:r>
-                  <w:rPr>
-                    <w:rFonts w:ascii="Poppins" w:hAnsi="Poppins" w:cs="Poppins"/>
-                    <w:color w:val="FFFFFF"/>
-                    <w:spacing w:val="-2"/>
-                    <w:sz w:val="20"/>
-                  </w:rPr>
-                  <w:t>2</w:t>
-                </w:r>
-                <w:r>
-                  <w:rPr>
-                    <w:rFonts w:ascii="Poppins" w:hAnsi="Poppins" w:cs="Poppins"/>
-                    <w:color w:val="FFFFFF"/>
-                    <w:spacing w:val="-2"/>
-                    <w:sz w:val="20"/>
-                  </w:rPr>
-                  <w:fldChar w:fldCharType="end"/>
-                </w:r>
-                <w:r>
-                  <w:rPr>
-                    <w:rFonts w:ascii="Poppins" w:hAnsi="Poppins" w:cs="Poppins"/>
-                    <w:color w:val="FFFFFF"/>
-                    <w:spacing w:val="-14"/>
-                    <w:sz w:val="20"/>
-                  </w:rPr>
-                  <w:t xml:space="preserve"> </w:t>
-                </w:r>
-                <w:r>
-                  <w:rPr>
-                    <w:rFonts w:ascii="Poppins" w:hAnsi="Poppins" w:cs="Poppins"/>
-                    <w:color w:val="FFFFFF"/>
-                    <w:spacing w:val="-2"/>
-                    <w:sz w:val="20"/>
-                  </w:rPr>
-                  <w:t>/</w:t>
-                </w:r>
-                <w:r>
-                  <w:rPr>
-                    <w:rFonts w:ascii="Poppins" w:hAnsi="Poppins" w:cs="Poppins"/>
-                    <w:color w:val="FFFFFF"/>
-                    <w:spacing w:val="-11"/>
-                    <w:sz w:val="20"/>
-                  </w:rPr>
-                  <w:t xml:space="preserve"> </w:t>
-                </w:r>
-                <w:r>
-                  <w:rPr>
-                    <w:rFonts w:ascii="Poppins" w:hAnsi="Poppins" w:cs="Poppins"/>
-                    <w:color w:val="FFFFFF"/>
-                    <w:spacing w:val="-5"/>
-                    <w:sz w:val="20"/>
-                  </w:rPr>
-                  <w:fldChar w:fldCharType="begin"/>
-                </w:r>
-                <w:r>
-                  <w:rPr>
-                    <w:rFonts w:ascii="Poppins" w:hAnsi="Poppins" w:cs="Poppins"/>
-                    <w:color w:val="FFFFFF"/>
-                    <w:spacing w:val="-5"/>
-                    <w:sz w:val="20"/>
-                  </w:rPr>
-                  <w:instrText xml:space="preserve"> NUMPAGES </w:instrText>
-                </w:r>
-                <w:r>
-                  <w:rPr>
-                    <w:rFonts w:ascii="Poppins" w:hAnsi="Poppins" w:cs="Poppins"/>
-                    <w:color w:val="FFFFFF"/>
-                    <w:spacing w:val="-5"/>
-                    <w:sz w:val="20"/>
-                  </w:rPr>
-                  <w:fldChar w:fldCharType="separate"/>
-                </w:r>
-                <w:r>
-                  <w:rPr>
-                    <w:rFonts w:ascii="Poppins" w:hAnsi="Poppins" w:cs="Poppins"/>
-                    <w:color w:val="FFFFFF"/>
-                    <w:spacing w:val="-5"/>
-                    <w:sz w:val="20"/>
-                  </w:rPr>
-                  <w:t>2</w:t>
-                </w:r>
-                <w:r>
-                  <w:rPr>
-                    <w:rFonts w:ascii="Poppins" w:hAnsi="Poppins" w:cs="Poppins"/>
-                    <w:color w:val="FFFFFF"/>
-                    <w:spacing w:val="-5"/>
-                    <w:sz w:val="20"/>
-                  </w:rPr>
-                  <w:fldChar w:fldCharType="end"/>
-                </w:r>
-                <w:r>
-                  <w:rPr>
-                    <w:rFonts w:ascii="Poppins" w:hAnsi="Poppins" w:cs="Poppins"/>
-                    <w:color w:val="FFFFFF"/>
-                    <w:spacing w:val="-5"/>
-                    <w:sz w:val="20"/>
-                  </w:rPr>
-                  <w:t>)</w:t>
-                </w:r>
-              </w:p>
-              <w:p>
-                <w:pPr>
-                  <w:spacing w:line="218" w:lineRule="exact"/>
-                  <w:ind w:left="20"/>
-                  <w:rPr>
-                    <w:rFonts w:ascii="Poppins" w:hAnsi="Poppins" w:cs="Poppins"/>
-                    <w:sz w:val="18"/>
-                  </w:rPr>
-                </w:pPr>
-                <w:proofErr w:type="gramStart"/>
-                <w:r>
-                  <w:rPr>
-                    <w:rFonts w:ascii="Poppins" w:hAnsi="Poppins" w:cs="Poppins"/>
-                    <w:color w:val="FFFFFF"/>
-                    <w:w w:val="95"/>
-                    <w:sz w:val="18"/>
-                  </w:rPr>
-                  <w:t>{{ theme</w:t>
-                </w:r>
-                <w:proofErr w:type="gramEnd"/>
-                <w:r>
-                  <w:rPr>
-                    <w:rFonts w:ascii="Poppins" w:hAnsi="Poppins" w:cs="Poppins"/>
-                    <w:color w:val="FFFFFF"/>
-                    <w:w w:val="95"/>
-                    <w:sz w:val="18"/>
-                  </w:rPr>
-                  <w:t xml:space="preserve"> }}</w:t>
-                </w:r>
-              </w:p>
-            </w:txbxContent>
-          </v:textbox>
-          <w10:wrap anchorx="page" anchory="page"/>
-        </v:shape>
-      </w:pict>
+      <w:rPr>
+        <w:noProof/>
+      </w:rPr>
+      <w:drawing>
+        <wp:anchor distT="0" distB="0" distL="0" distR="0" simplePos="0" relativeHeight="251658240" behindDoc="1" locked="0" layoutInCell="1" allowOverlap="1">
+          <wp:simplePos x="0" y="0"/>
+          <wp:positionH relativeFrom="page">
+            <wp:posOffset>0</wp:posOffset>
+          </wp:positionH>
+          <wp:positionV relativeFrom="page">
+            <wp:posOffset>0</wp:posOffset>
+          </wp:positionV>
+          <wp:extent cx="3771600" cy="530352"/>
+          <wp:effectExtent l="0" t="0" r="0" b="0"/>
+          <wp:wrapNone/>
+          <wp:docPr id="101" name="BlueBackground"/>
+          <wp:cNvGraphicFramePr/>
+          <a:graphic>
+            <a:graphicData uri="http://schemas.microsoft.com/office/word/2010/wordprocessingShape">
+              <wps:wsp>
+                <wps:cNvSpPr>
+                  <a:spLocks noChangeArrowheads="1"/>
+                </wps:cNvSpPr>
+                <wps:spPr>
+                  <a:xfrm>
+                    <a:off x="0" y="0"/>
+                    <a:ext cx="3771600" cy="530352"/>
+                  </a:xfrm>
+                  <a:prstGeom prst="rect">
+                    <a:avLst/>
+                  </a:prstGeom>
+                  <a:solidFill>
+                    <a:srgbClr val="1F487C"/>
+                  </a:solidFill>
+                  <a:ln>
+                    <a:noFill/>
+                  </a:ln>
+                </wps:spPr>
+                <wps:bodyPr/>
+              </wps:wsp>
+            </a:graphicData>
+          </a:graphic>
+        </wp:anchor>
+      </w:drawing>
     </w:r>
+    <!-- Title text box: "Equity Capital Market Updates (PAGE / NUMPAGES)" -->
     <w:r>
-      <w:pict w14:anchorId="211FBDC6">
-        <v:group id="docshapegroup1" o:spid="_x0000_s1029" style="position:absolute;margin-left:0;margin-top:0;width:297pt;height:41.8pt;z-index:-15779328;mso-position-horizontal-relative:page;mso-position-vertical-relative:page" coordsize="5940,836">
-          <v:rect id="docshape2" o:spid="_x0000_s1031" style="position:absolute;width:5940;height:836" fillcolor="#1f487c" stroked="f"/>
-          <v:line id="_x0000_s1030" style="position:absolute" from="0,830" to="5940,830" strokecolor="#7e7e7e" strokeweight=".5pt">
-            <v:stroke dashstyle="3 1"/>
-          </v:line>
-          <w10:wrap anchorx="page" anchory="page"/>
-        </v:group>
-      </w:pict>
+      <w:rPr>
+        <w:noProof/>
+      </w:rPr>
+      <w:drawing>
+        <wp:anchor distT="0" distB="0" distL="0" distR="0" simplePos="0" relativeHeight="251660288" behindDoc="0" locked="0" layoutInCell="1" allowOverlap="1">
+          <wp:simplePos x="0" y="0"/>
+          <wp:positionH relativeFrom="page">
+            <wp:posOffset>154940</wp:posOffset>
+          </wp:positionH>
+          <wp:positionV relativeFrom="page">
+            <wp:posOffset>159944</wp:posOffset>
+          </wp:positionV>
+          <wp:extent cx="3291840" cy="339090"/>
+          <wp:effectExtent l="0" t="0" r="0" b="0"/>
+          <wp:wrapNone/>
+          <wp:docPr id="102" name="TitleTextBox"/>
+          <wp:cNvGraphicFramePr/>
+          <a:graphic>
+            <a:graphicData uri="http://schemas.microsoft.com/office/word/2010/wordprocessingShape">
+              <wps:wsp>
+                <wps:cNvSpPr txBx="1">
+                  <a:spLocks noChangeArrowheads="1"/>
+                </wps:cNvSpPr>
+                <wps:spPr>
+                  <a:xfrm>
+                    <a:off x="154940" y="159944"/>
+                    <a:ext cx="3291840" cy="339090"/>
+                  </a:xfrm>
+                  <a:prstGeom prst="rect">
+                    <a:avLst/>
+                  </a:prstGeom>
+                  <a:noFill/>
+                  <a:ln>
+                    <a:noFill/>
+                  </a:ln>
+                </wps:spPr>
+                <wps:txbx>
+                  <w:txbxContent>
+                    <w:p>
+                      <w:pPr>
+                        <w:spacing w:before="0" w:after="0" w:line="242" w:lineRule="exact"/>
+                        <w:ind w:left="20"/>
+                      </w:pPr>
+                      <w:r>
+                        <w:rPr>
+                          <w:rFonts w:ascii="Poppins" w:hAnsi="Poppins" w:cs="Poppins"/>
+                          <w:color w:val="FFFFFF"/>
+                          <w:sz w:val="20"/>
+                        </w:rPr>
+                        <w:t xml:space="preserve">Equity Capital Market Updates (</w:t>
+                      </w:r>
+                      <w:r>
+                        <w:rPr>
+                          <w:rFonts w:ascii="Poppins" w:hAnsi="Poppins" w:cs="Poppins"/>
+                          <w:color w:val="FFFFFF"/>
+                          <w:sz w:val="20"/>
+                        </w:rPr>
+                        <w:fldChar w:fldCharType="begin"/>
+                      </w:r>
+                      <w:r>
+                        <w:rPr>
+                          <w:rFonts w:ascii="Poppins" w:hAnsi="Poppins" w:cs="Poppins"/>
+                          <w:color w:val="FFFFFF"/>
+                          <w:sz w:val="20"/>
+                        </w:rPr>
+                        <w:instrText xml:space="preserve"> PAGE </w:instrText>
+                      </w:r>
+                      <w:r>
+                        <w:rPr>
+                          <w:rFonts w:ascii="Poppins" w:hAnsi="Poppins" w:cs="Poppins"/>
+                          <w:color w:val="FFFFFF"/>
+                          <w:sz w:val="20"/>
+                        </w:rPr>
+                        <w:fldChar w:fldCharType="separate"/>
+                      </w:r>
+                      <w:r>
+                        <w:rPr>
+                          <w:rFonts w:ascii="Poppins" w:hAnsi="Poppins" w:cs="Poppins"/>
+                          <w:color w:val="FFFFFF"/>
+                          <w:sz w:val="20"/>
+                        </w:rPr>
+                        <w:t>1</w:t>
+                      </w:r>
+                      <w:r>
+                        <w:rPr>
+                          <w:rFonts w:ascii="Poppins" w:hAnsi="Poppins" w:cs="Poppins"/>
+                          <w:color w:val="FFFFFF"/>
+                          <w:sz w:val="20"/>
+                        </w:rPr>
+                        <w:fldChar w:fldCharType="end"/>
+                      </w:r>
+                      <w:r>
+                        <w:rPr>
+                          <w:rFonts w:ascii="Poppins" w:hAnsi="Poppins" w:cs="Poppins"/>
+                          <w:color w:val="FFFFFF"/>
+                          <w:sz w:val="20"/>
+                        </w:rPr>
+                        <w:t xml:space="preserve"> / </w:t>
+                      </w:r>
+                      <w:r>
+                        <w:rPr>
+                          <w:rFonts w:ascii="Poppins" w:hAnsi="Poppins" w:cs="Poppins"/>
+                          <w:color w:val="FFFFFF"/>
+                          <w:sz w:val="20"/>
+                        </w:rPr>
+                        <w:fldChar w:fldCharType="begin"/>
+                      </w:r>
+                      <w:r>
+                        <w:rPr>
+                          <w:rFonts w:ascii="Poppins" w:hAnsi="Poppins" w:cs="Poppins"/>
+                          <w:color w:val="FFFFFF"/>
+                          <w:sz w:val="20"/>
+                        </w:rPr>
+                        <w:instrText xml:space="preserve"> NUMPAGES </w:instrText>
+                      </w:r>
+                      <w:r>
+                        <w:rPr>
+                          <w:rFonts w:ascii="Poppins" w:hAnsi="Poppins" w:cs="Poppins"/>
+                          <w:color w:val="FFFFFF"/>
+                          <w:sz w:val="20"/>
+                        </w:rPr>
+                        <w:fldChar w:fldCharType="separate"/>
+                      </w:r>
+                      <w:r>
+                        <w:rPr>
+                          <w:rFonts w:ascii="Poppins" w:hAnsi="Poppins" w:cs="Poppins"/>
+                          <w:color w:val="FFFFFF"/>
+                          <w:sz w:val="20"/>
+                        </w:rPr>
+                        <w:t>2</w:t>
+                      </w:r>
+                      <w:r>
+                        <w:rPr>
+                          <w:rFonts w:ascii="Poppins" w:hAnsi="Poppins" w:cs="Poppins"/>
+                          <w:color w:val="FFFFFF"/>
+                          <w:sz w:val="20"/>
+                        </w:rPr>
+                        <w:fldChar w:fldCharType="end"/>
+                      </w:r>
+                      <w:r>
+                        <w:rPr>
+                          <w:rFonts w:ascii="Poppins" w:hAnsi="Poppins" w:cs="Poppins"/>
+                          <w:color w:val="FFFFFF"/>
+                          <w:sz w:val="20"/>
+                        </w:rPr>
+                        <w:t>)</w:t>
+                      </w:r>
+                    </w:p>
+                    <!-- Theme line -->
+                    <w:p>
+                      <w:pPr>
+                        <w:spacing w:before="0" w:after="0" w:line="218" w:lineRule="exact"/>
+                        <w:ind w:left="20"/>
+                      </w:pPr>
+                      <w:r>
+                        <w:rPr>
+                          <w:rFonts w:ascii="Poppins" w:hAnsi="Poppins" w:cs="Poppins"/>
+                          <w:color w:val="FFFFFF"/>
+                          <w:sz w:val="18"/>
+                        </w:rPr>
+                        <w:t>{{ theme }}</w:t>
+                      </w:r>
+                    </w:p>
+                  </w:txbxContent>
+                </wps:txbx>
+                <wps:bodyPr insFigure="0" rot="0" spcFirstLastPara="0" vertOverflow="clip" horzOverflow="clip" vert="horz" wrap="square" lIns="0" tIns="0" rIns="0" bIns="0" numCol="1" spcCol="0" rtlCol="0" fromWordArt="0" anchor="t" anchorCtr="0" forceAA="0" compatLnSpc="1">
+                  <a:prstTxWarp prst="textNoShape">
+                    <a:avLst/>
+                  </a:prstTxWarp>
+                </wps:bodyPr>
+              </wps:wsp>
+            </a:graphicData>
+          </a:graphic>
+        </wp:anchor>
+      </w:drawing>
     </w:r>
+    <!-- Newsletter / date text box (top right) -->
     <w:r>
-      <w:pict w14:anchorId="59C02B8C">
-        <v:shape id="docshape3" o:spid="_x0000_s1028" type="#_x0000_t202" style="position:absolute;margin-left:233.55pt;margin-top:9.9pt;width:51.55pt;height:18.45pt;z-index:-15778816;mso-position-horizontal-relative:page;mso-position-vertical-relative:page" filled="f" stroked="f">
-          <v:textbox style="mso-next-textbox:#docshape3" inset="0,0,0,0">
-            <w:txbxContent>
-              <w:p>
-                <w:pPr>
-                  <w:spacing w:before="25" w:line="276" w:lineRule="auto"/>
-                  <w:ind w:left="20" w:right="10" w:firstLine="247"/>
-                  <w:rPr>
-                    <w:rFonts w:ascii="Poppins" w:hAnsi="Poppins" w:cs="Poppins"/>
-                    <w:sz w:val="12"/>
-                  </w:rPr>
-                </w:pPr>
-                <w:r>
-                  <w:rPr>
-                    <w:rFonts w:ascii="Poppins" w:hAnsi="Poppins" w:cs="Poppins"/>
-                    <w:color w:val="FFFFFF"/>
-                    <w:spacing w:val="-2"/>
-                    <w:w w:val="105"/>
-                    <w:sz w:val="12"/>
-                  </w:rPr>
-                  <w:t>Newsletter</w:t>
-                </w:r>
-                <w:r>
-                  <w:rPr>
-                    <w:rFonts w:ascii="Poppins" w:hAnsi="Poppins" w:cs="Poppins"/>
-                    <w:color w:val="FFFFFF"/>
-                    <w:spacing w:val="-11"/>
-                    <w:w w:val="105"/>
-                    <w:sz w:val="12"/>
-                  </w:rPr>
-                  <w:t xml:space="preserve"> </w:t>
-                </w:r>
-                <w:r>
-                  <w:rPr>
-                    <w:rFonts w:ascii="Poppins" w:hAnsi="Poppins" w:cs="Poppins"/>
-                    <w:color w:val="FFFFFF"/>
-                    <w:spacing w:val="-2"/>
-                    <w:w w:val="105"/>
-                    <w:sz w:val="12"/>
-                  </w:rPr>
-                  <w:t>–</w:t>
-                </w:r>
-                <w:r>
-                  <w:rPr>
-                    <w:rFonts w:ascii="Poppins" w:hAnsi="Poppins" w:cs="Poppins"/>
-                    <w:color w:val="FFFFFF"/>
-                    <w:spacing w:val="40"/>
-                    <w:w w:val="105"/>
-                    <w:sz w:val="12"/>
-                  </w:rPr>
-                  <w:t xml:space="preserve"> </w:t>
-                </w:r>
-                <w:r>
-                  <w:rPr>
-                    <w:rFonts w:ascii="Poppins" w:hAnsi="Poppins" w:cs="Poppins"/>
-                    <w:color w:val="FFFFFF"/>
-                    <w:w w:val="105"/>
-                    <w:sz w:val="12"/>
-                  </w:rPr>
-                  <w:t>{{date}}</w:t>
-                </w:r>
-              </w:p>
-            </w:txbxContent>
-          </v:textbox>
-          <w10:wrap anchorx="page" anchory="page"/>
-        </v:shape>
-      </w:pict>
+      <w:rPr>
+        <w:noProof/>
+      </w:rPr>
+      <w:drawing>
+        <wp:anchor distT="0" distB="0" distL="0" distR="0" simplePos="0" relativeHeight="251659264" behindDoc="0" locked="0" layoutInCell="1" allowOverlap="1">
+          <wp:simplePos x="0" y="0"/>
+          <wp:positionH relativeFrom="page">
+            <wp:posOffset>2965070</wp:posOffset>
+          </wp:positionH>
+          <wp:positionV relativeFrom="page">
+            <wp:posOffset>125730</wp:posOffset>
+          </wp:positionV>
+          <wp:extent cx="654305" cy="234315"/>
+          <wp:effectExtent l="0" t="0" r="0" b="0"/>
+          <wp:wrapNone/>
+          <wp:docPr id="103" name="DateTextBox"/>
+          <wp:cNvGraphicFramePr/>
+          <a:graphic>
+            <a:graphicData uri="http://schemas.microsoft.com/office/word/2010/wordprocessingShape">
+              <wps:wsp>
+                <wps:cNvSpPr txBx="1">
+                  <a:spLocks noChangeArrowheads="1"/>
+                </wps:cNvSpPr>
+                <wps:spPr>
+                  <a:xfrm>
+                    <a:off x="2965070" y="125730"/>
+                    <a:ext cx="654305" cy="234315"/>
+                  </a:xfrm>
+                  <a:prstGeom prst="rect">
+                    <a:avLst/>
+                  </a:prstGeom>
+                  <a:noFill/>
+                  <a:ln>
+                    <a:noFill/>
+                  </a:ln>
+                </wps:spPr>
+                <wps:txbx>
+                  <w:txbxContent>
+                    <w:p>
+                      <w:pPr>
+                        <w:spacing w:before="0" w:after="0" w:line="276" w:lineRule="auto"/>
+                        <w:ind w:left="20" w:right="10"/>
+                        <w:jc w:val="right"/>
+                      </w:pPr>
+                      <w:r>
+                        <w:rPr>
+                          <w:rFonts w:ascii="Poppins" w:hAnsi="Poppins" w:cs="Poppins"/>
+                          <w:color w:val="FFFFFF"/>
+                          <w:sz w:val="12"/>
+                        </w:rPr>
+                        <w:t xml:space="preserve">Newsletter – {{date}}</w:t>
+                      </w:r>
+                    </w:p>
+                  </w:txbxContent>
+                </wps:txbx>
+                <wps:bodyPr insFigure="0" rot="0" spcFirstLastPara="0" vertOverflow="clip" horzOverflow="clip" vert="horz" wrap="square" lIns="0" tIns="0" rIns="0" bIns="0" numCol="1" spcCol="0" rtlCol="0" fromWordArt="0" anchor="ctr" anchorCtr="0" forceAA="0" compatLnSpc="1">
+                  <a:prstTxWarp prst="textNoShape">
+                    <a:avLst/>
+                  </a:prstTxWarp>
+                </wps:bodyPr>
+              </wps:wsp>
+            </a:graphicData>
+          </a:graphic>
+        </wp:anchor>
+      </w:drawing>
     </w:r>
   </w:p>
 </w:hdr>

</xml_diff>